<commit_message>
docs: update user guide for department management + registration changes
Reflects the features merged from main: the new "Khoa" (Department)
master data + filter on Creator/public advisor browsing, the now-
mandatory "Sinh viên đủ điều kiện" list on a Term (empty no longer
means "open to everyone"), the required phone number on student
profile, the submit-cart race-condition safety popup, and the
Creator email-uniqueness rule. Applied to both the Markdown and
Word versions of the guide.

Co-Authored-By: Claude Sonnet 5 <noreply@anthropic.com>
Claude-Session: https://claude.ai/code/session_019NB8jbdRknj1ucgjTqZ569
</commit_message>
<xml_diff>
--- a/docs/HUONG_DAN_SU_DUNG_HE_THONG_CHON_GVHD.docx
+++ b/docs/HUONG_DAN_SU_DUNG_HE_THONG_CHON_GVHD.docx
@@ -722,7 +722,7 @@
           <w:sz w:val="18"/>
           <w:szCs w:val="18"/>
         </w:rPr>
-        <w:t xml:space="preserve">    ├── Kỳ đồ án                        → Quản lý các đợt đăng ký chọn GVHD</w:t>
+        <w:t xml:space="preserve">    ├── Khoa                             → Danh sách Khoa (gán/lọc giảng viên theo Khoa)</w:t>
       </w:r>
     </w:p>
     <w:p>
@@ -736,7 +736,7 @@
           <w:sz w:val="18"/>
           <w:szCs w:val="18"/>
         </w:rPr>
-        <w:t xml:space="preserve">    ├── Đăng ký chọn GVHD               → Xem toàn bộ hồ sơ đăng ký của sinh viên</w:t>
+        <w:t xml:space="preserve">    ├── Kỳ đồ án                        → Quản lý các đợt đăng ký chọn GVHD</w:t>
       </w:r>
     </w:p>
     <w:p>
@@ -750,7 +750,7 @@
           <w:sz w:val="18"/>
           <w:szCs w:val="18"/>
         </w:rPr>
-        <w:t xml:space="preserve">    ├── Phân bổ sinh viên cho giảng viên → Bảng Kanban gán/chuyển sinh viên</w:t>
+        <w:t xml:space="preserve">    ├── Đăng ký chọn GVHD               → Xem toàn bộ hồ sơ đăng ký của sinh viên</w:t>
       </w:r>
     </w:p>
     <w:p>
@@ -764,6 +764,20 @@
           <w:sz w:val="18"/>
           <w:szCs w:val="18"/>
         </w:rPr>
+        <w:t xml:space="preserve">    ├── Phân bổ sinh viên cho giảng viên → Bảng Kanban gán/chuyển sinh viên</w:t>
+      </w:r>
+    </w:p>
+    <w:p>
+      <w:pPr>
+        <w:shd w:fill="F4F4F4" w:val="clear"/>
+        <w:spacing w:after="0" w:line="240"/>
+      </w:pPr>
+      <w:r>
+        <w:rPr>
+          <w:rFonts w:ascii="Consolas" w:cs="Consolas" w:eastAsia="Consolas" w:hAnsi="Consolas"/>
+          <w:sz w:val="18"/>
+          <w:szCs w:val="18"/>
+        </w:rPr>
         <w:t xml:space="preserve">    └── Phân bổ giảng viên theo kỳ       → Bảng Kanban thêm giảng viên vào kỳ</w:t>
       </w:r>
     </w:p>
@@ -805,6 +819,36 @@
         <w:rPr>
           <w:rFonts w:ascii="Calibri" w:cs="Calibri" w:eastAsia="Calibri" w:hAnsi="Calibri"/>
         </w:rPr>
+        <w:t xml:space="preserve">(Tuỳ chọn, làm 1 lần) Vào </w:t>
+      </w:r>
+      <w:r>
+        <w:rPr>
+          <w:rFonts w:ascii="Calibri" w:cs="Calibri" w:eastAsia="Calibri" w:hAnsi="Calibri"/>
+          <w:b/>
+          <w:bCs/>
+        </w:rPr>
+        <w:t xml:space="preserve">Cấu hình đồ án → Khoa</w:t>
+      </w:r>
+      <w:r>
+        <w:rPr>
+          <w:rFonts w:ascii="Calibri" w:cs="Calibri" w:eastAsia="Calibri" w:hAnsi="Calibri"/>
+        </w:rPr>
+        <w:t xml:space="preserve">, tạo trước danh sách các Khoa (VD: Công nghệ thông tin, Điện - Điện tử...) nếu muốn phân loại/lọc giảng viên theo Khoa trên trang công khai.</w:t>
+      </w:r>
+    </w:p>
+    <w:p>
+      <w:pPr>
+        <w:pStyle w:val="ListParagraph"/>
+        <w:numPr>
+          <w:ilvl w:val="0"/>
+          <w:numId w:val="2"/>
+        </w:numPr>
+        <w:spacing w:after="100"/>
+      </w:pPr>
+      <w:r>
+        <w:rPr>
+          <w:rFonts w:ascii="Calibri" w:cs="Calibri" w:eastAsia="Calibri" w:hAnsi="Calibri"/>
+        </w:rPr>
         <w:t xml:space="preserve">Vào </w:t>
       </w:r>
       <w:r>
@@ -819,7 +863,21 @@
         <w:rPr>
           <w:rFonts w:ascii="Calibri" w:cs="Calibri" w:eastAsia="Calibri" w:hAnsi="Calibri"/>
         </w:rPr>
-        <w:t xml:space="preserve">, tạo mới hoặc mở hồ sơ giảng viên (nhập Tên, Email liên hệ, Vai trò, Lĩnh vực...).</w:t>
+        <w:t xml:space="preserve">, tạo mới hoặc mở hồ sơ giảng viên (nhập Tên, Email liên hệ, Vai trò, Khoa, Lĩnh vực...). Trường </w:t>
+      </w:r>
+      <w:r>
+        <w:rPr>
+          <w:rFonts w:ascii="Calibri" w:cs="Calibri" w:eastAsia="Calibri" w:hAnsi="Calibri"/>
+          <w:b/>
+          <w:bCs/>
+        </w:rPr>
+        <w:t xml:space="preserve">"Khoa"</w:t>
+      </w:r>
+      <w:r>
+        <w:rPr>
+          <w:rFonts w:ascii="Calibri" w:cs="Calibri" w:eastAsia="Calibri" w:hAnsi="Calibri"/>
+        </w:rPr>
+        <w:t xml:space="preserve"> chỉ dùng để lọc/hiển thị trên trang công khai — không giới hạn việc sinh viên khoa khác chọn giảng viên này, và giảng viên không tự sửa được trường này qua Portal (chỉ Admin gán ở backend).</w:t>
       </w:r>
     </w:p>
     <w:p>
@@ -897,7 +955,7 @@
           <w:i/>
           <w:iCs/>
         </w:rPr>
-        <w:t xml:space="preserve">Lưu ý: Nếu sau này giảng viên tự đổi Tên hoặc Email trong hồ sơ Portal của họ, hệ thống sẽ tự đồng bộ hai chiều với tài khoản Odoo (kể cả tên đăng nhập). Nếu email trùng với một tài khoản đăng nhập khác đang tồn tại, hệ thống sẽ báo lỗi và không cho lưu.</w:t>
+        <w:t xml:space="preserve">Lưu ý: Nếu sau này giảng viên tự đổi Tên hoặc Email trong hồ sơ Portal của họ, hệ thống sẽ tự đồng bộ hai chiều với tài khoản Odoo (kể cả tên đăng nhập). Email liên hệ của mỗi Tác giả phải là duy nhất trong toàn hệ thống — nếu trùng với tên đăng nhập của tài khoản khác, hoặc trùng với 1 Tác giả khác, hệ thống sẽ báo lỗi và không cho lưu; nếu trùng với 1 Liên hệ (Contact) có sẵn nhưng cùng tên (đúng là cùng 1 người), hệ thống sẽ cho phép và tự tái sử dụng đúng Liên hệ đó khi bấm "Tạo tài khoản người dùng".</w:t>
       </w:r>
     </w:p>
     <w:p>
@@ -1077,8 +1135,16 @@
       <w:r>
         <w:rPr>
           <w:rFonts w:ascii="Calibri" w:cs="Calibri" w:eastAsia="Calibri" w:hAnsi="Calibri"/>
-        </w:rPr>
-        <w:t xml:space="preserve">(Tuỳ chọn) Tab </w:t>
+          <w:b/>
+          <w:bCs/>
+        </w:rPr>
+        <w:t xml:space="preserve">Bắt buộc</w:t>
+      </w:r>
+      <w:r>
+        <w:rPr>
+          <w:rFonts w:ascii="Calibri" w:cs="Calibri" w:eastAsia="Calibri" w:hAnsi="Calibri"/>
+        </w:rPr>
+        <w:t xml:space="preserve"> — Tab </w:t>
       </w:r>
       <w:r>
         <w:rPr>
@@ -1092,21 +1158,21 @@
         <w:rPr>
           <w:rFonts w:ascii="Calibri" w:cs="Calibri" w:eastAsia="Calibri" w:hAnsi="Calibri"/>
         </w:rPr>
-        <w:t xml:space="preserve">: nếu chỉ muốn một danh sách sinh viên cụ thể được tham gia kỳ này (ví dụ mỗi khoa chạy một kỳ riêng), thêm danh sách sinh viên vào đây. Để trống nghĩa là </w:t>
-      </w:r>
-      <w:r>
-        <w:rPr>
-          <w:rFonts w:ascii="Calibri" w:cs="Calibri" w:eastAsia="Calibri" w:hAnsi="Calibri"/>
-          <w:b/>
-          <w:bCs/>
-        </w:rPr>
-        <w:t xml:space="preserve">mọi</w:t>
-      </w:r>
-      <w:r>
-        <w:rPr>
-          <w:rFonts w:ascii="Calibri" w:cs="Calibri" w:eastAsia="Calibri" w:hAnsi="Calibri"/>
-        </w:rPr>
-        <w:t xml:space="preserve"> sinh viên Portal đều thấy và đăng ký được kỳ này.</w:t>
+        <w:t xml:space="preserve">: thêm danh sách sinh viên được phép tham gia kỳ này (có thể thêm trực tiếp ngay trong bảng). </w:t>
+      </w:r>
+      <w:r>
+        <w:rPr>
+          <w:rFonts w:ascii="Calibri" w:cs="Calibri" w:eastAsia="Calibri" w:hAnsi="Calibri"/>
+          <w:b/>
+          <w:bCs/>
+        </w:rPr>
+        <w:t xml:space="preserve">Để trống danh sách này nghĩa là chưa sinh viên nào đăng ký được ở kỳ này</w:t>
+      </w:r>
+      <w:r>
+        <w:rPr>
+          <w:rFonts w:ascii="Calibri" w:cs="Calibri" w:eastAsia="Calibri" w:hAnsi="Calibri"/>
+        </w:rPr>
+        <w:t xml:space="preserve">, kể cả khi kỳ đã "Đang mở" — không còn là "mở cho tất cả" như trước nữa, nên bước này không được bỏ qua dù chỉ mở đúng 1 kỳ duy nhất. Nếu có nhiều Khoa mở kỳ song song, mỗi sinh viên chỉ nên có tên ở đúng 1 kỳ của khoa mình.</w:t>
       </w:r>
     </w:p>
     <w:p>
@@ -1162,6 +1228,24 @@
           <w:rFonts w:ascii="Calibri" w:cs="Calibri" w:eastAsia="Calibri" w:hAnsi="Calibri"/>
         </w:rPr>
         <w:t xml:space="preserve">.</w:t>
+      </w:r>
+    </w:p>
+    <w:p>
+      <w:pPr>
+        <w:pBdr>
+          <w:left w:val="single" w:color="7B3F61" w:sz="18"/>
+        </w:pBdr>
+        <w:shd w:fill="F2E9EE" w:val="clear"/>
+        <w:spacing w:after="200" w:before="120"/>
+        <w:ind w:left="200"/>
+      </w:pPr>
+      <w:r>
+        <w:rPr>
+          <w:rFonts w:ascii="Calibri" w:cs="Calibri" w:eastAsia="Calibri" w:hAnsi="Calibri"/>
+          <w:i/>
+          <w:iCs/>
+        </w:rPr>
+        <w:t xml:space="preserve">Lưu ý quan trọng: Nếu quên khai "Sinh viên đủ điều kiện" (hoặc quên thêm 1 sinh viên cụ thể vào danh sách), sinh viên đó sẽ vào trang /my/advisor và thấy cảnh báo "Hiện có kỳ đồ án đang mở nhưng bạn chưa có trong danh sách 'Sinh viên đủ điều kiện' của kỳ nào — vui lòng liên hệ Khoa/Admin để được bổ sung." — khác với thông báo "chưa có kỳ nào mở" khi thực sự không có kỳ nào đang mở. Nút thống kê "SV đủ điều kiện" trên form Kỳ mở ra đúng danh sách này kèm MSSV/Lớp/Ngành/SĐT để Admin đối chiếu nhanh.</w:t>
       </w:r>
     </w:p>
     <w:p>
@@ -3655,7 +3739,21 @@
         <w:rPr>
           <w:rFonts w:ascii="Calibri" w:cs="Calibri" w:eastAsia="Calibri" w:hAnsi="Calibri"/>
         </w:rPr>
-        <w:t xml:space="preserve">, sau đó bấm </w:t>
+        <w:t xml:space="preserve">, </w:t>
+      </w:r>
+      <w:r>
+        <w:rPr>
+          <w:rFonts w:ascii="Calibri" w:cs="Calibri" w:eastAsia="Calibri" w:hAnsi="Calibri"/>
+          <w:b/>
+          <w:bCs/>
+        </w:rPr>
+        <w:t xml:space="preserve">Số điện thoại</w:t>
+      </w:r>
+      <w:r>
+        <w:rPr>
+          <w:rFonts w:ascii="Calibri" w:cs="Calibri" w:eastAsia="Calibri" w:hAnsi="Calibri"/>
+        </w:rPr>
+        <w:t xml:space="preserve"> (đều bắt buộc), sau đó bấm </w:t>
       </w:r>
       <w:r>
         <w:rPr>
@@ -3670,6 +3768,405 @@
           <w:rFonts w:ascii="Calibri" w:cs="Calibri" w:eastAsia="Calibri" w:hAnsi="Calibri"/>
         </w:rPr>
         <w:t xml:space="preserve">.</w:t>
+      </w:r>
+    </w:p>
+    <w:p>
+      <w:pPr>
+        <w:spacing w:after="160"/>
+      </w:pPr>
+      <w:r>
+        <w:rPr>
+          <w:rFonts w:ascii="Calibri" w:cs="Calibri" w:eastAsia="Calibri" w:hAnsi="Calibri"/>
+        </w:rPr>
+        <w:t xml:space="preserve">Tuỳ tình huống, trang sẽ báo 1 trong 2 thông báo khác nhau — phân biệt rõ để biết cần liên hệ ai:</w:t>
+      </w:r>
+    </w:p>
+    <w:p>
+      <w:pPr>
+        <w:pStyle w:val="ListParagraph"/>
+        <w:numPr>
+          <w:ilvl w:val="0"/>
+          <w:numId w:val="3"/>
+        </w:numPr>
+        <w:spacing w:after="100"/>
+      </w:pPr>
+      <w:r>
+        <w:rPr>
+          <w:rFonts w:ascii="Calibri" w:cs="Calibri" w:eastAsia="Calibri" w:hAnsi="Calibri"/>
+        </w:rPr>
+        <w:t xml:space="preserve">"Hiện không có kỳ đồ án nào đang mở đăng ký chọn giảng viên hướng dẫn." — chưa có kỳ nào được Nhà trường/Khoa mở, chưa cần làm gì, chờ thông báo mở đợt.</w:t>
+      </w:r>
+    </w:p>
+    <w:p>
+      <w:pPr>
+        <w:pStyle w:val="ListParagraph"/>
+        <w:numPr>
+          <w:ilvl w:val="0"/>
+          <w:numId w:val="3"/>
+        </w:numPr>
+        <w:spacing w:after="100"/>
+      </w:pPr>
+      <w:r>
+        <w:rPr>
+          <w:rFonts w:ascii="Calibri" w:cs="Calibri" w:eastAsia="Calibri" w:hAnsi="Calibri"/>
+        </w:rPr>
+        <w:t xml:space="preserve">"Hiện có kỳ đồ án đang mở nhưng bạn chưa có trong danh sách 'Sinh viên đủ điều kiện' của kỳ nào." — đã có kỳ mở nhưng bạn chưa được thêm vào danh sách được phép đăng ký — cần liên hệ Admin/Khoa để được bổ sung tên vào danh sách, không phải lỗi hệ thống.</w:t>
+      </w:r>
+    </w:p>
+    <w:p>
+      <w:pPr>
+        <w:pStyle w:val="Heading2"/>
+        <w:spacing w:after="180" w:before="360"/>
+      </w:pPr>
+      <w:r>
+        <w:t xml:space="preserve">3.2. Tìm hiểu và chọn giảng viên</w:t>
+      </w:r>
+    </w:p>
+    <w:p>
+      <w:pPr>
+        <w:spacing w:after="160"/>
+      </w:pPr>
+      <w:r>
+        <w:rPr>
+          <w:rFonts w:ascii="Calibri" w:cs="Calibri" w:eastAsia="Calibri" w:hAnsi="Calibri"/>
+        </w:rPr>
+        <w:t xml:space="preserve">Trước khi chọn, bạn nên tham khảo trang giới thiệu giảng viên trên trang web công khai (mục Khám phá → Giảng viên hướng dẫn đồ án, hoặc /showcase?section=advisors):</w:t>
+      </w:r>
+    </w:p>
+    <w:p>
+      <w:pPr>
+        <w:pStyle w:val="ListParagraph"/>
+        <w:numPr>
+          <w:ilvl w:val="0"/>
+          <w:numId w:val="3"/>
+        </w:numPr>
+        <w:spacing w:after="100"/>
+      </w:pPr>
+      <w:r>
+        <w:rPr>
+          <w:rFonts w:ascii="Calibri" w:cs="Calibri" w:eastAsia="Calibri" w:hAnsi="Calibri"/>
+        </w:rPr>
+        <w:t xml:space="preserve">Có thể lọc theo </w:t>
+      </w:r>
+      <w:r>
+        <w:rPr>
+          <w:rFonts w:ascii="Calibri" w:cs="Calibri" w:eastAsia="Calibri" w:hAnsi="Calibri"/>
+          <w:b/>
+          <w:bCs/>
+        </w:rPr>
+        <w:t xml:space="preserve">Kỳ đồ án</w:t>
+      </w:r>
+      <w:r>
+        <w:rPr>
+          <w:rFonts w:ascii="Calibri" w:cs="Calibri" w:eastAsia="Calibri" w:hAnsi="Calibri"/>
+        </w:rPr>
+        <w:t xml:space="preserve">, </w:t>
+      </w:r>
+      <w:r>
+        <w:rPr>
+          <w:rFonts w:ascii="Calibri" w:cs="Calibri" w:eastAsia="Calibri" w:hAnsi="Calibri"/>
+          <w:b/>
+          <w:bCs/>
+        </w:rPr>
+        <w:t xml:space="preserve">Danh mục/Lĩnh vực</w:t>
+      </w:r>
+      <w:r>
+        <w:rPr>
+          <w:rFonts w:ascii="Calibri" w:cs="Calibri" w:eastAsia="Calibri" w:hAnsi="Calibri"/>
+        </w:rPr>
+        <w:t xml:space="preserve">, </w:t>
+      </w:r>
+      <w:r>
+        <w:rPr>
+          <w:rFonts w:ascii="Calibri" w:cs="Calibri" w:eastAsia="Calibri" w:hAnsi="Calibri"/>
+          <w:b/>
+          <w:bCs/>
+        </w:rPr>
+        <w:t xml:space="preserve">Khoa</w:t>
+      </w:r>
+      <w:r>
+        <w:rPr>
+          <w:rFonts w:ascii="Calibri" w:cs="Calibri" w:eastAsia="Calibri" w:hAnsi="Calibri"/>
+        </w:rPr>
+        <w:t xml:space="preserve">, và </w:t>
+      </w:r>
+      <w:r>
+        <w:rPr>
+          <w:rFonts w:ascii="Calibri" w:cs="Calibri" w:eastAsia="Calibri" w:hAnsi="Calibri"/>
+          <w:b/>
+          <w:bCs/>
+        </w:rPr>
+        <w:t xml:space="preserve">Trạng thái nhận SV</w:t>
+      </w:r>
+      <w:r>
+        <w:rPr>
+          <w:rFonts w:ascii="Calibri" w:cs="Calibri" w:eastAsia="Calibri" w:hAnsi="Calibri"/>
+        </w:rPr>
+        <w:t xml:space="preserve"> (Còn nhận / Đã đầy).</w:t>
+      </w:r>
+    </w:p>
+    <w:p>
+      <w:pPr>
+        <w:pStyle w:val="ListParagraph"/>
+        <w:numPr>
+          <w:ilvl w:val="0"/>
+          <w:numId w:val="3"/>
+        </w:numPr>
+        <w:spacing w:after="100"/>
+      </w:pPr>
+      <w:r>
+        <w:rPr>
+          <w:rFonts w:ascii="Calibri" w:cs="Calibri" w:eastAsia="Calibri" w:hAnsi="Calibri"/>
+        </w:rPr>
+        <w:t xml:space="preserve">Sắp xếp theo Liên quan, Còn nhiều chỗ nhất, hoặc Mới thêm gần đây.</w:t>
+      </w:r>
+    </w:p>
+    <w:p>
+      <w:pPr>
+        <w:pStyle w:val="ListParagraph"/>
+        <w:numPr>
+          <w:ilvl w:val="0"/>
+          <w:numId w:val="3"/>
+        </w:numPr>
+        <w:spacing w:after="100"/>
+      </w:pPr>
+      <w:r>
+        <w:rPr>
+          <w:rFonts w:ascii="Calibri" w:cs="Calibri" w:eastAsia="Calibri" w:hAnsi="Calibri"/>
+        </w:rPr>
+        <w:t xml:space="preserve">Bấm vào một giảng viên để xem trang chi tiết: giới thiệu bản thân, đề tài gợi ý, các đề tài đã từng hướng dẫn trước đây, số chỗ còn trống, email/website liên hệ.</w:t>
+      </w:r>
+    </w:p>
+    <w:p>
+      <w:pPr>
+        <w:pStyle w:val="ListParagraph"/>
+        <w:numPr>
+          <w:ilvl w:val="0"/>
+          <w:numId w:val="3"/>
+        </w:numPr>
+        <w:spacing w:after="100"/>
+      </w:pPr>
+      <w:r>
+        <w:rPr>
+          <w:rFonts w:ascii="Calibri" w:cs="Calibri" w:eastAsia="Calibri" w:hAnsi="Calibri"/>
+        </w:rPr>
+        <w:t xml:space="preserve">Nếu giảng viên còn chỗ trống và bạn thuộc kỳ đang mở, sẽ thấy nút </w:t>
+      </w:r>
+      <w:r>
+        <w:rPr>
+          <w:rFonts w:ascii="Calibri" w:cs="Calibri" w:eastAsia="Calibri" w:hAnsi="Calibri"/>
+          <w:b/>
+          <w:bCs/>
+        </w:rPr>
+        <w:t xml:space="preserve">"Chọn làm giảng viên hướng dẫn"</w:t>
+      </w:r>
+      <w:r>
+        <w:rPr>
+          <w:rFonts w:ascii="Calibri" w:cs="Calibri" w:eastAsia="Calibri" w:hAnsi="Calibri"/>
+        </w:rPr>
+        <w:t xml:space="preserve"> — bấm vào sẽ đưa bạn tới trang /my/advisor để thêm giảng viên đó vào hàng chờ nguyện vọng.</w:t>
+      </w:r>
+    </w:p>
+    <w:p>
+      <w:pPr>
+        <w:pStyle w:val="Heading2"/>
+        <w:spacing w:after="180" w:before="360"/>
+      </w:pPr>
+      <w:r>
+        <w:t xml:space="preserve">3.3. Xây dựng hàng chờ nguyện vọng</w:t>
+      </w:r>
+    </w:p>
+    <w:p>
+      <w:pPr>
+        <w:spacing w:after="160"/>
+      </w:pPr>
+      <w:r>
+        <w:rPr>
+          <w:rFonts w:ascii="Calibri" w:cs="Calibri" w:eastAsia="Calibri" w:hAnsi="Calibri"/>
+        </w:rPr>
+        <w:t xml:space="preserve">Tại trang /my/advisor, khi hồ sơ đăng ký còn ở trạng thái chưa nộp, bạn sẽ thấy khu vực </w:t>
+      </w:r>
+      <w:r>
+        <w:rPr>
+          <w:rFonts w:ascii="Calibri" w:cs="Calibri" w:eastAsia="Calibri" w:hAnsi="Calibri"/>
+          <w:b/>
+          <w:bCs/>
+        </w:rPr>
+        <w:t xml:space="preserve">"Hàng chờ nguyện vọng"</w:t>
+      </w:r>
+      <w:r>
+        <w:rPr>
+          <w:rFonts w:ascii="Calibri" w:cs="Calibri" w:eastAsia="Calibri" w:hAnsi="Calibri"/>
+        </w:rPr>
+        <w:t xml:space="preserve"> (tối đa theo số lượng do Admin cấu hình, ví dụ 5):</w:t>
+      </w:r>
+    </w:p>
+    <w:p>
+      <w:pPr>
+        <w:pStyle w:val="ListParagraph"/>
+        <w:numPr>
+          <w:ilvl w:val="0"/>
+          <w:numId w:val="2"/>
+        </w:numPr>
+        <w:spacing w:after="100"/>
+      </w:pPr>
+      <w:r>
+        <w:rPr>
+          <w:rFonts w:ascii="Calibri" w:cs="Calibri" w:eastAsia="Calibri" w:hAnsi="Calibri"/>
+        </w:rPr>
+        <w:t xml:space="preserve">Ở phần </w:t>
+      </w:r>
+      <w:r>
+        <w:rPr>
+          <w:rFonts w:ascii="Calibri" w:cs="Calibri" w:eastAsia="Calibri" w:hAnsi="Calibri"/>
+          <w:b/>
+          <w:bCs/>
+        </w:rPr>
+        <w:t xml:space="preserve">"Thêm giảng viên vào hàng chờ"</w:t>
+      </w:r>
+      <w:r>
+        <w:rPr>
+          <w:rFonts w:ascii="Calibri" w:cs="Calibri" w:eastAsia="Calibri" w:hAnsi="Calibri"/>
+        </w:rPr>
+        <w:t xml:space="preserve">: chọn 1 giảng viên từ danh sách (hiển thị kèm số chỗ còn trống), điền </w:t>
+      </w:r>
+      <w:r>
+        <w:rPr>
+          <w:rFonts w:ascii="Calibri" w:cs="Calibri" w:eastAsia="Calibri" w:hAnsi="Calibri"/>
+          <w:b/>
+          <w:bCs/>
+        </w:rPr>
+        <w:t xml:space="preserve">Đề tài dự kiến</w:t>
+      </w:r>
+      <w:r>
+        <w:rPr>
+          <w:rFonts w:ascii="Calibri" w:cs="Calibri" w:eastAsia="Calibri" w:hAnsi="Calibri"/>
+        </w:rPr>
+        <w:t xml:space="preserve"> (nếu có), viết vài dòng giới thiệu bản thân với thầy/cô đó, rồi bấm </w:t>
+      </w:r>
+      <w:r>
+        <w:rPr>
+          <w:rFonts w:ascii="Calibri" w:cs="Calibri" w:eastAsia="Calibri" w:hAnsi="Calibri"/>
+          <w:b/>
+          <w:bCs/>
+        </w:rPr>
+        <w:t xml:space="preserve">"Thêm vào hàng chờ"</w:t>
+      </w:r>
+      <w:r>
+        <w:rPr>
+          <w:rFonts w:ascii="Calibri" w:cs="Calibri" w:eastAsia="Calibri" w:hAnsi="Calibri"/>
+        </w:rPr>
+        <w:t xml:space="preserve">.</w:t>
+      </w:r>
+    </w:p>
+    <w:p>
+      <w:pPr>
+        <w:pStyle w:val="ListParagraph"/>
+        <w:numPr>
+          <w:ilvl w:val="0"/>
+          <w:numId w:val="2"/>
+        </w:numPr>
+        <w:spacing w:after="100"/>
+      </w:pPr>
+      <w:r>
+        <w:rPr>
+          <w:rFonts w:ascii="Calibri" w:cs="Calibri" w:eastAsia="Calibri" w:hAnsi="Calibri"/>
+        </w:rPr>
+        <w:t xml:space="preserve">Lặp lại để thêm nhiều giảng viên khác (theo thứ tự bạn ưu tiên nhất trước).</w:t>
+      </w:r>
+    </w:p>
+    <w:p>
+      <w:pPr>
+        <w:pStyle w:val="ListParagraph"/>
+        <w:numPr>
+          <w:ilvl w:val="0"/>
+          <w:numId w:val="2"/>
+        </w:numPr>
+        <w:spacing w:after="100"/>
+      </w:pPr>
+      <w:r>
+        <w:rPr>
+          <w:rFonts w:ascii="Calibri" w:cs="Calibri" w:eastAsia="Calibri" w:hAnsi="Calibri"/>
+        </w:rPr>
+        <w:t xml:space="preserve">Trong bảng hàng chờ, dùng nút </w:t>
+      </w:r>
+      <w:r>
+        <w:rPr>
+          <w:rFonts w:ascii="Calibri" w:cs="Calibri" w:eastAsia="Calibri" w:hAnsi="Calibri"/>
+          <w:b/>
+          <w:bCs/>
+        </w:rPr>
+        <w:t xml:space="preserve">↑ / ↓</w:t>
+      </w:r>
+      <w:r>
+        <w:rPr>
+          <w:rFonts w:ascii="Calibri" w:cs="Calibri" w:eastAsia="Calibri" w:hAnsi="Calibri"/>
+        </w:rPr>
+        <w:t xml:space="preserve"> để sắp xếp lại thứ tự ưu tiên, hoặc </w:t>
+      </w:r>
+      <w:r>
+        <w:rPr>
+          <w:rFonts w:ascii="Calibri" w:cs="Calibri" w:eastAsia="Calibri" w:hAnsi="Calibri"/>
+          <w:b/>
+          <w:bCs/>
+        </w:rPr>
+        <w:t xml:space="preserve">"Xoá"</w:t>
+      </w:r>
+      <w:r>
+        <w:rPr>
+          <w:rFonts w:ascii="Calibri" w:cs="Calibri" w:eastAsia="Calibri" w:hAnsi="Calibri"/>
+        </w:rPr>
+        <w:t xml:space="preserve"> để bỏ một giảng viên khỏi danh sách.</w:t>
+      </w:r>
+    </w:p>
+    <w:p>
+      <w:pPr>
+        <w:pStyle w:val="ListParagraph"/>
+        <w:numPr>
+          <w:ilvl w:val="0"/>
+          <w:numId w:val="2"/>
+        </w:numPr>
+        <w:spacing w:after="100"/>
+      </w:pPr>
+      <w:r>
+        <w:rPr>
+          <w:rFonts w:ascii="Calibri" w:cs="Calibri" w:eastAsia="Calibri" w:hAnsi="Calibri"/>
+        </w:rPr>
+        <w:t xml:space="preserve">Không thể chọn trùng một giảng viên hai lần, và không thể thêm giảng viên đã hết chỗ hoặc đã rút khỏi kỳ.</w:t>
+      </w:r>
+    </w:p>
+    <w:p>
+      <w:pPr>
+        <w:pStyle w:val="Heading2"/>
+        <w:spacing w:after="180" w:before="360"/>
+      </w:pPr>
+      <w:r>
+        <w:t xml:space="preserve">3.4. Nộp nguyện vọng</w:t>
+      </w:r>
+    </w:p>
+    <w:p>
+      <w:pPr>
+        <w:spacing w:after="160"/>
+      </w:pPr>
+      <w:r>
+        <w:rPr>
+          <w:rFonts w:ascii="Calibri" w:cs="Calibri" w:eastAsia="Calibri" w:hAnsi="Calibri"/>
+        </w:rPr>
+        <w:t xml:space="preserve">Khi đã sắp xếp xong thứ tự ưu tiên, bấm </w:t>
+      </w:r>
+      <w:r>
+        <w:rPr>
+          <w:rFonts w:ascii="Calibri" w:cs="Calibri" w:eastAsia="Calibri" w:hAnsi="Calibri"/>
+          <w:b/>
+          <w:bCs/>
+        </w:rPr>
+        <w:t xml:space="preserve">"Nộp nguyện vọng"</w:t>
+      </w:r>
+      <w:r>
+        <w:rPr>
+          <w:rFonts w:ascii="Calibri" w:cs="Calibri" w:eastAsia="Calibri" w:hAnsi="Calibri"/>
+        </w:rPr>
+        <w:t xml:space="preserve"> và xác nhận trong hộp thoại.</w:t>
       </w:r>
     </w:p>
     <w:p>
@@ -3687,349 +4184,7 @@
           <w:i/>
           <w:iCs/>
         </w:rPr>
-        <w:t xml:space="preserve">Nếu trang báo "Hiện không có kỳ đồ án nào đang mở đăng ký", nghĩa là Nhà trường/Khoa chưa mở đợt đăng ký chọn GVHD, hoặc bạn không thuộc danh sách sinh viên đủ điều kiện của kỳ hiện có — hãy liên hệ Admin/khoa để được xác nhận.</w:t>
-      </w:r>
-    </w:p>
-    <w:p>
-      <w:pPr>
-        <w:pStyle w:val="Heading2"/>
-        <w:spacing w:after="180" w:before="360"/>
-      </w:pPr>
-      <w:r>
-        <w:t xml:space="preserve">3.2. Tìm hiểu và chọn giảng viên</w:t>
-      </w:r>
-    </w:p>
-    <w:p>
-      <w:pPr>
-        <w:spacing w:after="160"/>
-      </w:pPr>
-      <w:r>
-        <w:rPr>
-          <w:rFonts w:ascii="Calibri" w:cs="Calibri" w:eastAsia="Calibri" w:hAnsi="Calibri"/>
-        </w:rPr>
-        <w:t xml:space="preserve">Trước khi chọn, bạn nên tham khảo trang giới thiệu giảng viên trên trang web công khai (mục Khám phá → Giảng viên hướng dẫn đồ án, hoặc /showcase?section=advisors):</w:t>
-      </w:r>
-    </w:p>
-    <w:p>
-      <w:pPr>
-        <w:pStyle w:val="ListParagraph"/>
-        <w:numPr>
-          <w:ilvl w:val="0"/>
-          <w:numId w:val="3"/>
-        </w:numPr>
-        <w:spacing w:after="100"/>
-      </w:pPr>
-      <w:r>
-        <w:rPr>
-          <w:rFonts w:ascii="Calibri" w:cs="Calibri" w:eastAsia="Calibri" w:hAnsi="Calibri"/>
-        </w:rPr>
-        <w:t xml:space="preserve">Có thể lọc theo </w:t>
-      </w:r>
-      <w:r>
-        <w:rPr>
-          <w:rFonts w:ascii="Calibri" w:cs="Calibri" w:eastAsia="Calibri" w:hAnsi="Calibri"/>
-          <w:b/>
-          <w:bCs/>
-        </w:rPr>
-        <w:t xml:space="preserve">Kỳ đồ án</w:t>
-      </w:r>
-      <w:r>
-        <w:rPr>
-          <w:rFonts w:ascii="Calibri" w:cs="Calibri" w:eastAsia="Calibri" w:hAnsi="Calibri"/>
-        </w:rPr>
-        <w:t xml:space="preserve">, </w:t>
-      </w:r>
-      <w:r>
-        <w:rPr>
-          <w:rFonts w:ascii="Calibri" w:cs="Calibri" w:eastAsia="Calibri" w:hAnsi="Calibri"/>
-          <w:b/>
-          <w:bCs/>
-        </w:rPr>
-        <w:t xml:space="preserve">Danh mục/Lĩnh vực</w:t>
-      </w:r>
-      <w:r>
-        <w:rPr>
-          <w:rFonts w:ascii="Calibri" w:cs="Calibri" w:eastAsia="Calibri" w:hAnsi="Calibri"/>
-        </w:rPr>
-        <w:t xml:space="preserve">, và </w:t>
-      </w:r>
-      <w:r>
-        <w:rPr>
-          <w:rFonts w:ascii="Calibri" w:cs="Calibri" w:eastAsia="Calibri" w:hAnsi="Calibri"/>
-          <w:b/>
-          <w:bCs/>
-        </w:rPr>
-        <w:t xml:space="preserve">Trạng thái nhận SV</w:t>
-      </w:r>
-      <w:r>
-        <w:rPr>
-          <w:rFonts w:ascii="Calibri" w:cs="Calibri" w:eastAsia="Calibri" w:hAnsi="Calibri"/>
-        </w:rPr>
-        <w:t xml:space="preserve"> (Còn nhận / Đã đầy).</w:t>
-      </w:r>
-    </w:p>
-    <w:p>
-      <w:pPr>
-        <w:pStyle w:val="ListParagraph"/>
-        <w:numPr>
-          <w:ilvl w:val="0"/>
-          <w:numId w:val="3"/>
-        </w:numPr>
-        <w:spacing w:after="100"/>
-      </w:pPr>
-      <w:r>
-        <w:rPr>
-          <w:rFonts w:ascii="Calibri" w:cs="Calibri" w:eastAsia="Calibri" w:hAnsi="Calibri"/>
-        </w:rPr>
-        <w:t xml:space="preserve">Sắp xếp theo Liên quan, Còn nhiều chỗ nhất, hoặc Mới thêm gần đây.</w:t>
-      </w:r>
-    </w:p>
-    <w:p>
-      <w:pPr>
-        <w:pStyle w:val="ListParagraph"/>
-        <w:numPr>
-          <w:ilvl w:val="0"/>
-          <w:numId w:val="3"/>
-        </w:numPr>
-        <w:spacing w:after="100"/>
-      </w:pPr>
-      <w:r>
-        <w:rPr>
-          <w:rFonts w:ascii="Calibri" w:cs="Calibri" w:eastAsia="Calibri" w:hAnsi="Calibri"/>
-        </w:rPr>
-        <w:t xml:space="preserve">Bấm vào một giảng viên để xem trang chi tiết: giới thiệu bản thân, đề tài gợi ý, các đề tài đã từng hướng dẫn trước đây, số chỗ còn trống, email/website liên hệ.</w:t>
-      </w:r>
-    </w:p>
-    <w:p>
-      <w:pPr>
-        <w:pStyle w:val="ListParagraph"/>
-        <w:numPr>
-          <w:ilvl w:val="0"/>
-          <w:numId w:val="3"/>
-        </w:numPr>
-        <w:spacing w:after="100"/>
-      </w:pPr>
-      <w:r>
-        <w:rPr>
-          <w:rFonts w:ascii="Calibri" w:cs="Calibri" w:eastAsia="Calibri" w:hAnsi="Calibri"/>
-        </w:rPr>
-        <w:t xml:space="preserve">Nếu giảng viên còn chỗ trống và bạn thuộc kỳ đang mở, sẽ thấy nút </w:t>
-      </w:r>
-      <w:r>
-        <w:rPr>
-          <w:rFonts w:ascii="Calibri" w:cs="Calibri" w:eastAsia="Calibri" w:hAnsi="Calibri"/>
-          <w:b/>
-          <w:bCs/>
-        </w:rPr>
-        <w:t xml:space="preserve">"Chọn làm giảng viên hướng dẫn"</w:t>
-      </w:r>
-      <w:r>
-        <w:rPr>
-          <w:rFonts w:ascii="Calibri" w:cs="Calibri" w:eastAsia="Calibri" w:hAnsi="Calibri"/>
-        </w:rPr>
-        <w:t xml:space="preserve"> — bấm vào sẽ đưa bạn tới trang /my/advisor để thêm giảng viên đó vào hàng chờ nguyện vọng.</w:t>
-      </w:r>
-    </w:p>
-    <w:p>
-      <w:pPr>
-        <w:pStyle w:val="Heading2"/>
-        <w:spacing w:after="180" w:before="360"/>
-      </w:pPr>
-      <w:r>
-        <w:t xml:space="preserve">3.3. Xây dựng hàng chờ nguyện vọng</w:t>
-      </w:r>
-    </w:p>
-    <w:p>
-      <w:pPr>
-        <w:spacing w:after="160"/>
-      </w:pPr>
-      <w:r>
-        <w:rPr>
-          <w:rFonts w:ascii="Calibri" w:cs="Calibri" w:eastAsia="Calibri" w:hAnsi="Calibri"/>
-        </w:rPr>
-        <w:t xml:space="preserve">Tại trang /my/advisor, khi hồ sơ đăng ký còn ở trạng thái chưa nộp, bạn sẽ thấy khu vực </w:t>
-      </w:r>
-      <w:r>
-        <w:rPr>
-          <w:rFonts w:ascii="Calibri" w:cs="Calibri" w:eastAsia="Calibri" w:hAnsi="Calibri"/>
-          <w:b/>
-          <w:bCs/>
-        </w:rPr>
-        <w:t xml:space="preserve">"Hàng chờ nguyện vọng"</w:t>
-      </w:r>
-      <w:r>
-        <w:rPr>
-          <w:rFonts w:ascii="Calibri" w:cs="Calibri" w:eastAsia="Calibri" w:hAnsi="Calibri"/>
-        </w:rPr>
-        <w:t xml:space="preserve"> (tối đa theo số lượng do Admin cấu hình, ví dụ 5):</w:t>
-      </w:r>
-    </w:p>
-    <w:p>
-      <w:pPr>
-        <w:pStyle w:val="ListParagraph"/>
-        <w:numPr>
-          <w:ilvl w:val="0"/>
-          <w:numId w:val="2"/>
-        </w:numPr>
-        <w:spacing w:after="100"/>
-      </w:pPr>
-      <w:r>
-        <w:rPr>
-          <w:rFonts w:ascii="Calibri" w:cs="Calibri" w:eastAsia="Calibri" w:hAnsi="Calibri"/>
-        </w:rPr>
-        <w:t xml:space="preserve">Ở phần </w:t>
-      </w:r>
-      <w:r>
-        <w:rPr>
-          <w:rFonts w:ascii="Calibri" w:cs="Calibri" w:eastAsia="Calibri" w:hAnsi="Calibri"/>
-          <w:b/>
-          <w:bCs/>
-        </w:rPr>
-        <w:t xml:space="preserve">"Thêm giảng viên vào hàng chờ"</w:t>
-      </w:r>
-      <w:r>
-        <w:rPr>
-          <w:rFonts w:ascii="Calibri" w:cs="Calibri" w:eastAsia="Calibri" w:hAnsi="Calibri"/>
-        </w:rPr>
-        <w:t xml:space="preserve">: chọn 1 giảng viên từ danh sách (hiển thị kèm số chỗ còn trống), điền </w:t>
-      </w:r>
-      <w:r>
-        <w:rPr>
-          <w:rFonts w:ascii="Calibri" w:cs="Calibri" w:eastAsia="Calibri" w:hAnsi="Calibri"/>
-          <w:b/>
-          <w:bCs/>
-        </w:rPr>
-        <w:t xml:space="preserve">Đề tài dự kiến</w:t>
-      </w:r>
-      <w:r>
-        <w:rPr>
-          <w:rFonts w:ascii="Calibri" w:cs="Calibri" w:eastAsia="Calibri" w:hAnsi="Calibri"/>
-        </w:rPr>
-        <w:t xml:space="preserve"> (nếu có), viết vài dòng giới thiệu bản thân với thầy/cô đó, rồi bấm </w:t>
-      </w:r>
-      <w:r>
-        <w:rPr>
-          <w:rFonts w:ascii="Calibri" w:cs="Calibri" w:eastAsia="Calibri" w:hAnsi="Calibri"/>
-          <w:b/>
-          <w:bCs/>
-        </w:rPr>
-        <w:t xml:space="preserve">"Thêm vào hàng chờ"</w:t>
-      </w:r>
-      <w:r>
-        <w:rPr>
-          <w:rFonts w:ascii="Calibri" w:cs="Calibri" w:eastAsia="Calibri" w:hAnsi="Calibri"/>
-        </w:rPr>
-        <w:t xml:space="preserve">.</w:t>
-      </w:r>
-    </w:p>
-    <w:p>
-      <w:pPr>
-        <w:pStyle w:val="ListParagraph"/>
-        <w:numPr>
-          <w:ilvl w:val="0"/>
-          <w:numId w:val="2"/>
-        </w:numPr>
-        <w:spacing w:after="100"/>
-      </w:pPr>
-      <w:r>
-        <w:rPr>
-          <w:rFonts w:ascii="Calibri" w:cs="Calibri" w:eastAsia="Calibri" w:hAnsi="Calibri"/>
-        </w:rPr>
-        <w:t xml:space="preserve">Lặp lại để thêm nhiều giảng viên khác (theo thứ tự bạn ưu tiên nhất trước).</w:t>
-      </w:r>
-    </w:p>
-    <w:p>
-      <w:pPr>
-        <w:pStyle w:val="ListParagraph"/>
-        <w:numPr>
-          <w:ilvl w:val="0"/>
-          <w:numId w:val="2"/>
-        </w:numPr>
-        <w:spacing w:after="100"/>
-      </w:pPr>
-      <w:r>
-        <w:rPr>
-          <w:rFonts w:ascii="Calibri" w:cs="Calibri" w:eastAsia="Calibri" w:hAnsi="Calibri"/>
-        </w:rPr>
-        <w:t xml:space="preserve">Trong bảng hàng chờ, dùng nút </w:t>
-      </w:r>
-      <w:r>
-        <w:rPr>
-          <w:rFonts w:ascii="Calibri" w:cs="Calibri" w:eastAsia="Calibri" w:hAnsi="Calibri"/>
-          <w:b/>
-          <w:bCs/>
-        </w:rPr>
-        <w:t xml:space="preserve">↑ / ↓</w:t>
-      </w:r>
-      <w:r>
-        <w:rPr>
-          <w:rFonts w:ascii="Calibri" w:cs="Calibri" w:eastAsia="Calibri" w:hAnsi="Calibri"/>
-        </w:rPr>
-        <w:t xml:space="preserve"> để sắp xếp lại thứ tự ưu tiên, hoặc </w:t>
-      </w:r>
-      <w:r>
-        <w:rPr>
-          <w:rFonts w:ascii="Calibri" w:cs="Calibri" w:eastAsia="Calibri" w:hAnsi="Calibri"/>
-          <w:b/>
-          <w:bCs/>
-        </w:rPr>
-        <w:t xml:space="preserve">"Xoá"</w:t>
-      </w:r>
-      <w:r>
-        <w:rPr>
-          <w:rFonts w:ascii="Calibri" w:cs="Calibri" w:eastAsia="Calibri" w:hAnsi="Calibri"/>
-        </w:rPr>
-        <w:t xml:space="preserve"> để bỏ một giảng viên khỏi danh sách.</w:t>
-      </w:r>
-    </w:p>
-    <w:p>
-      <w:pPr>
-        <w:pStyle w:val="ListParagraph"/>
-        <w:numPr>
-          <w:ilvl w:val="0"/>
-          <w:numId w:val="2"/>
-        </w:numPr>
-        <w:spacing w:after="100"/>
-      </w:pPr>
-      <w:r>
-        <w:rPr>
-          <w:rFonts w:ascii="Calibri" w:cs="Calibri" w:eastAsia="Calibri" w:hAnsi="Calibri"/>
-        </w:rPr>
-        <w:t xml:space="preserve">Không thể chọn trùng một giảng viên hai lần, và không thể thêm giảng viên đã hết chỗ hoặc đã rút khỏi kỳ.</w:t>
-      </w:r>
-    </w:p>
-    <w:p>
-      <w:pPr>
-        <w:pStyle w:val="Heading2"/>
-        <w:spacing w:after="180" w:before="360"/>
-      </w:pPr>
-      <w:r>
-        <w:t xml:space="preserve">3.4. Nộp nguyện vọng</w:t>
-      </w:r>
-    </w:p>
-    <w:p>
-      <w:pPr>
-        <w:spacing w:after="160"/>
-      </w:pPr>
-      <w:r>
-        <w:rPr>
-          <w:rFonts w:ascii="Calibri" w:cs="Calibri" w:eastAsia="Calibri" w:hAnsi="Calibri"/>
-        </w:rPr>
-        <w:t xml:space="preserve">Khi đã sắp xếp xong thứ tự ưu tiên, bấm </w:t>
-      </w:r>
-      <w:r>
-        <w:rPr>
-          <w:rFonts w:ascii="Calibri" w:cs="Calibri" w:eastAsia="Calibri" w:hAnsi="Calibri"/>
-          <w:b/>
-          <w:bCs/>
-        </w:rPr>
-        <w:t xml:space="preserve">"Nộp nguyện vọng"</w:t>
-      </w:r>
-      <w:r>
-        <w:rPr>
-          <w:rFonts w:ascii="Calibri" w:cs="Calibri" w:eastAsia="Calibri" w:hAnsi="Calibri"/>
-        </w:rPr>
-        <w:t xml:space="preserve"> và xác nhận trong hộp thoại.</w:t>
+        <w:t xml:space="preserve">Rất quan trọng: Sau khi nộp, bạn không thể sửa hoặc nộp lại hàng chờ nữa. Hãy kiểm tra kỹ thứ tự ưu tiên trước khi bấm nộp.</w:t>
       </w:r>
     </w:p>
     <w:p>
@@ -4047,7 +4202,7 @@
           <w:i/>
           <w:iCs/>
         </w:rPr>
-        <w:t xml:space="preserve">Rất quan trọng: Sau khi nộp, bạn không thể sửa hoặc nộp lại hàng chờ nữa. Hãy kiểm tra kỹ thứ tự ưu tiên trước khi bấm nộp.</w:t>
+        <w:t xml:space="preserve">Trường hợp hiếm gặp: nếu đúng lúc bạn bấm "Nộp nguyện vọng" mà 1 giảng viên trong hàng chờ của bạn vừa hết chỗ (ví dụ 1 sinh viên khác vừa nộp trúng suất cuối cùng trước bạn vài giây), hệ thống sẽ hiện popup báo rõ tên giảng viên đó đã bị tự động xoá khỏi hàng chờ — lúc này giỏ của bạn vẫn CHƯA được nộp, hãy chọn 1 giảng viên khác thay thế rồi bấm "Nộp nguyện vọng" lại.</w:t>
       </w:r>
     </w:p>
     <w:p>
@@ -4058,7 +4213,7 @@
         <w:rPr>
           <w:rFonts w:ascii="Calibri" w:cs="Calibri" w:eastAsia="Calibri" w:hAnsi="Calibri"/>
         </w:rPr>
-        <w:t xml:space="preserve">Sau khi nộp, hệ thống sẽ:</w:t>
+        <w:t xml:space="preserve">Sau khi nộp thành công, hệ thống sẽ:</w:t>
       </w:r>
     </w:p>
     <w:p>
@@ -4697,6 +4852,84 @@
         <w:t xml:space="preserve">Hệ thống sẽ cảnh báo trước khi cho đóng. Admin nên xử lý (gán tay hoặc cho chọn lại) trước khi đóng kỳ hẳn.</w:t>
       </w:r>
     </w:p>
+    <w:p>
+      <w:pPr>
+        <w:pStyle w:val="Heading3"/>
+        <w:spacing w:after="140" w:before="280"/>
+      </w:pPr>
+      <w:r>
+        <w:rPr>
+          <w:rFonts w:ascii="Calibri" w:cs="Calibri" w:eastAsia="Calibri" w:hAnsi="Calibri"/>
+          <w:b/>
+          <w:bCs/>
+        </w:rPr>
+        <w:t xml:space="preserve">Mở kỳ rồi mà không sinh viên nào thấy/đăng ký được là do đâu?</w:t>
+      </w:r>
+    </w:p>
+    <w:p>
+      <w:pPr>
+        <w:spacing w:after="160"/>
+      </w:pPr>
+      <w:r>
+        <w:rPr>
+          <w:rFonts w:ascii="Calibri" w:cs="Calibri" w:eastAsia="Calibri" w:hAnsi="Calibri"/>
+        </w:rPr>
+        <w:t xml:space="preserve">Rất có thể Admin quên khai (hoặc quên thêm 1 vài sinh viên vào) tab "Sinh viên đủ điều kiện" của kỳ đó — từ nay danh sách này là </w:t>
+      </w:r>
+      <w:r>
+        <w:rPr>
+          <w:rFonts w:ascii="Calibri" w:cs="Calibri" w:eastAsia="Calibri" w:hAnsi="Calibri"/>
+          <w:b/>
+          <w:bCs/>
+        </w:rPr>
+        <w:t xml:space="preserve">bắt buộc</w:t>
+      </w:r>
+      <w:r>
+        <w:rPr>
+          <w:rFonts w:ascii="Calibri" w:cs="Calibri" w:eastAsia="Calibri" w:hAnsi="Calibri"/>
+        </w:rPr>
+        <w:t xml:space="preserve">, để trống đồng nghĩa với "chưa ai đăng ký được", không còn là "mở cho tất cả" như phiên bản trước.</w:t>
+      </w:r>
+    </w:p>
+    <w:p>
+      <w:pPr>
+        <w:pStyle w:val="Heading3"/>
+        <w:spacing w:after="140" w:before="280"/>
+      </w:pPr>
+      <w:r>
+        <w:rPr>
+          <w:rFonts w:ascii="Calibri" w:cs="Calibri" w:eastAsia="Calibri" w:hAnsi="Calibri"/>
+          <w:b/>
+          <w:bCs/>
+        </w:rPr>
+        <w:t xml:space="preserve">Tạo 1 Tác giả mới với Email liên hệ trùng email đã có trong hệ thống thì sao?</w:t>
+      </w:r>
+    </w:p>
+    <w:p>
+      <w:pPr>
+        <w:spacing w:after="160"/>
+      </w:pPr>
+      <w:r>
+        <w:rPr>
+          <w:rFonts w:ascii="Calibri" w:cs="Calibri" w:eastAsia="Calibri" w:hAnsi="Calibri"/>
+        </w:rPr>
+        <w:t xml:space="preserve">Bị chặn lưu, trừ khi email đó thuộc đúng 1 Liên hệ </w:t>
+      </w:r>
+      <w:r>
+        <w:rPr>
+          <w:rFonts w:ascii="Calibri" w:cs="Calibri" w:eastAsia="Calibri" w:hAnsi="Calibri"/>
+          <w:b/>
+          <w:bCs/>
+        </w:rPr>
+        <w:t xml:space="preserve">cùng tên</w:t>
+      </w:r>
+      <w:r>
+        <w:rPr>
+          <w:rFonts w:ascii="Calibri" w:cs="Calibri" w:eastAsia="Calibri" w:hAnsi="Calibri"/>
+        </w:rPr>
+        <w:t xml:space="preserve"> (hệ thống hiểu là cùng 1 người và cho tái sử dụng). Email liên hệ của mỗi Tác giả phải là duy nhất trong toàn hệ thống (xem thêm mục 1.2).</w:t>
+      </w:r>
+    </w:p>
     <w:sectPr>
       <w:pgSz w:w="11907" w:h="16840" w:orient="portrait"/>
       <w:pgMar w:top="1134" w:right="1134" w:bottom="1134" w:left="1134" w:header="708" w:footer="708" w:gutter="0"/>

</xml_diff>